<commit_message>
docs: update User Guide for v0.8.0 (settings page, index bar filter, multi-root scan, ignored dirs panel)
</commit_message>
<xml_diff>
--- a/info_docs/DocuBrowse_User_Guide.docx
+++ b/info_docs/DocuBrowse_User_Guide.docx
@@ -1003,7 +1003,7 @@
     </w:p>
     <w:p>
       <w:r>
-        <w:t xml:space="preserve">Edit docubrowse.config to set your document directories, or use the Settings page after starting the server. Optionally add additional scan directories (scan_dirs.txt) and directories to exclude (ignore_dirs.txt).</w:t>
+        <w:t>Edit docubrowse.config to set your document directories, or use the Settings page after starting the server. Optionally add additional scan directories (scan_dirs.txt) and directories to exclude (ignore_dirs.txt). If no document directory is configured yet, the search page shows a banner linking to Settings.</w:t>
       </w:r>
     </w:p>
     <w:p>
@@ -2358,7 +2358,7 @@
     </w:p>
     <w:p>
       <w:r>
-        <w:t xml:space="preserve">Additional scan directories can also be managed from Settings → General.</w:t>
+        <w:t>Additional scan directories can also be managed from Settings → General. Every configured directory (primary + additional) is scanned automatically by scan/rescan into the single shared database — no per-directory rescan command needed.</w:t>
       </w:r>
     </w:p>
     <w:p>
@@ -2691,7 +2691,7 @@
         </w:numPr>
       </w:pPr>
       <w:r>
-        <w:t xml:space="preserve">A-Z index bar — jump to documents by title's first letter</w:t>
+        <w:t>Index bar (Home, 0-9, A-Z) — Home returns to All Documents; clicking a letter performs a global search-wide filter for documents starting with that letter (not just the current page), paginated using your page-size preference. Click the active letter again to return to All Documents. The bar stays visible across All Documents, filtered, and search views.</w:t>
       </w:r>
     </w:p>
     <w:p>
@@ -2798,7 +2798,7 @@
     </w:p>
     <w:p>
       <w:r>
-        <w:t xml:space="preserve">The Settings page provides a browser-based interface for configuration that previously required editing files directly.</w:t>
+        <w:t>The Settings page (opened in a new tab via the gear icon) provides a full-width, browser-based interface for configuration that previously required editing files directly. A “Done” button in the header saves your changes and returns you to the search tab.</w:t>
       </w:r>
     </w:p>
     <w:p>
@@ -2842,7 +2842,7 @@
         </w:numPr>
       </w:pPr>
       <w:r>
-        <w:t xml:space="preserve">Trigger a rescan from the UI</w:t>
+        <w:t>Trigger a rescan from the UI — every configured directory (primary plus additional) is scanned automatically into the single shared database</w:t>
       </w:r>
     </w:p>
     <w:p>
@@ -2862,19 +2862,31 @@
         </w:numPr>
       </w:pPr>
       <w:r>
-        <w:t xml:space="preserve">Add, view, and remove directories excluded from scans (ignore_dirs.txt)</w:t>
-      </w:r>
-    </w:p>
-    <w:p>
-      <w:pPr>
-        <w:pStyle w:val="ListParagraph"/>
-        <w:numPr>
-          <w:ilvl w:val="0"/>
-          <w:numId w:val="2"/>
-        </w:numPr>
-      </w:pPr>
-      <w:r>
-        <w:t xml:space="preserve">Changes take effect on the next scan</w:t>
+        <w:t>Add a directory to exclude using the “Add a directory to exclude” input row; adding one prompts for confirmation, since indexed documents under that path will be purged</w:t>
+      </w:r>
+    </w:p>
+    <w:p>
+      <w:pPr>
+        <w:pStyle w:val="ListParagraph"/>
+        <w:numPr>
+          <w:ilvl w:val="0"/>
+          <w:numId w:val="2"/>
+        </w:numPr>
+      </w:pPr>
+      <w:r>
+        <w:t>Currently excluded directories are listed with inline ✕ remove buttons; removing one alerts you that a rescan is needed to re-index it</w:t>
+      </w:r>
+    </w:p>
+    <w:p>
+      <w:pPr>
+        <w:pStyle w:val="ListParagraph"/>
+        <w:numPr>
+          <w:ilvl w:val="0"/>
+          <w:numId w:val="2"/>
+        </w:numPr>
+      </w:pPr>
+      <w:r>
+        <w:t>Changes take effect on the next scan</w:t>
       </w:r>
     </w:p>
     <w:p>

</xml_diff>